<commit_message>
moving into visualization and stabilization of process
</commit_message>
<xml_diff>
--- a/HandoverFiles/Project Handover.docx
+++ b/HandoverFiles/Project Handover.docx
@@ -29,7 +29,7 @@
         <w:t xml:space="preserve"> February 1</w:t>
       </w:r>
       <w:r>
-        <w:t>6</w:t>
+        <w:t>8</w:t>
       </w:r>
       <w:r>
         <w:t>, 2026</w:t>
@@ -119,7 +119,16 @@
       </w:r>
       <w:proofErr w:type="gramEnd"/>
       <w:r>
-        <w:t xml:space="preserve"> are a programmer and visualization specialist with extensive experience in  R programming and</w:t>
+        <w:t xml:space="preserve"> are a</w:t>
+      </w:r>
+      <w:r>
+        <w:t>lso an R p</w:t>
+      </w:r>
+      <w:r>
+        <w:t>rogrammer and visualization specialist with extensive experience in  R programming and</w:t>
+      </w:r>
+      <w:r>
+        <w:t xml:space="preserve"> visualization. </w:t>
       </w:r>
     </w:p>
     <w:p>
@@ -487,7 +496,7 @@
     <w:p>
       <w:r>
         <w:pict w14:anchorId="7CFE0C26">
-          <v:rect id="_x0000_i1031" style="width:0;height:1.5pt" o:hralign="center" o:hrstd="t" o:hr="t" fillcolor="#a0a0a0" stroked="f"/>
+          <v:rect id="_x0000_i1025" style="width:0;height:1.5pt" o:hralign="center" o:hrstd="t" o:hr="t" fillcolor="#a0a0a0" stroked="f"/>
         </w:pict>
       </w:r>
     </w:p>
@@ -653,15 +662,7 @@
         <w:t>Post-Pandemic:</w:t>
       </w:r>
       <w:r>
-        <w:t xml:space="preserve"> Plan Year $\</w:t>
-      </w:r>
-      <w:proofErr w:type="spellStart"/>
-      <w:r>
-        <w:t>ge</w:t>
-      </w:r>
-      <w:proofErr w:type="spellEnd"/>
-      <w:r>
-        <w:t>$ 2022</w:t>
+        <w:t xml:space="preserve"> Plan Year  2022</w:t>
       </w:r>
     </w:p>
     <w:p>
@@ -2094,6 +2095,7 @@
   <w:style w:type="character" w:default="1" w:styleId="DefaultParagraphFont">
     <w:name w:val="Default Paragraph Font"/>
     <w:uiPriority w:val="1"/>
+    <w:semiHidden/>
     <w:unhideWhenUsed/>
   </w:style>
   <w:style w:type="table" w:default="1" w:styleId="TableNormal">

</xml_diff>